<commit_message>
Update User1 handover guide
</commit_message>
<xml_diff>
--- a/documents/residents-directory-user1-handover-guide.docx
+++ b/documents/residents-directory-user1-handover-guide.docx
@@ -425,7 +425,7 @@
                 <w:color w:val="000000"/>
                 <w:sz w:val="22"/>
               </w:rPr>
-              <w:t>8 August 2026</w:t>
+              <w:t>13 August 2026</w:t>
             </w:r>
           </w:p>
         </w:tc>
@@ -1161,7 +1161,7 @@
                 <w:color w:val="000000"/>
                 <w:sz w:val="22"/>
               </w:rPr>
-              <w:t>Clean local working tree; latest local commit 9c74c18, dated 21 July 2026</w:t>
+              <w:t>Latest confirmed publication commit 6b7f268, dated 13 August 2026</w:t>
             </w:r>
           </w:p>
         </w:tc>
@@ -8150,7 +8150,7 @@
         <w:color w:val="5B6573"/>
         <w:sz w:val="18"/>
       </w:rPr>
-      <w:t xml:space="preserve">Updated 8 August 2026  |  Page </w:t>
+      <w:t xml:space="preserve">Updated 13 August 2026  |  Page </w:t>
     </w:r>
     <w:r>
       <w:rPr>

</xml_diff>